<commit_message>
spec: regenerate 02_Specifications .docx mirrors (full re-sync phase 2)
Co-Authored-By: Claude Opus 4.8 <noreply@anthropic.com>
</commit_message>
<xml_diff>
--- a/02_Specifications/17_SEO_and_AI_Discoverability_Playbook.docx
+++ b/02_Specifications/17_SEO_and_AI_Discoverability_Playbook.docx
@@ -2,13 +2,267 @@
 <file path=word/document.xml><?xml version="1.0" encoding="utf-8"?>
 <w:document xmlns:w="http://schemas.openxmlformats.org/wordprocessingml/2006/main" xmlns:m="http://schemas.openxmlformats.org/officeDocument/2006/math" xmlns:r="http://schemas.openxmlformats.org/officeDocument/2006/relationships" xmlns:o="urn:schemas-microsoft-com:office:office" xmlns:v="urn:schemas-microsoft-com:vml" xmlns:w10="urn:schemas-microsoft-com:office:word" xmlns:a="http://schemas.openxmlformats.org/drawingml/2006/main" xmlns:pic="http://schemas.openxmlformats.org/drawingml/2006/picture" xmlns:wp="http://schemas.openxmlformats.org/drawingml/2006/wordprocessingDrawing">
   <w:body>
-    <w:bookmarkStart w:id="9" w:name="Xa27b4b61ee27764873e7981060468885ee558d3"/>
+    <w:bookmarkStart w:id="10" w:name="Xa27b4b61ee27764873e7981060468885ee558d3"/>
     <w:p>
       <w:pPr>
         <w:pStyle w:val="Heading1"/>
       </w:pPr>
       <w:r>
         <w:t xml:space="preserve">17 — SEO &amp; AI Discoverability Playbook for Setnayan</w:t>
+      </w:r>
+    </w:p>
+    <w:p>
+      <w:pPr>
+        <w:pStyle w:val="Heading2"/>
+      </w:pPr>
+      <w:bookmarkStart w:id="9" w:name="Xed6bce18f630baf5d4357bac255a6af4d848eb8"/>
+      <w:r>
+        <w:t xml:space="preserve">WARNING: AS-BUILT CORRECTION — 2026-06-07 (reconciled to live site + origin/main)</w:t>
+      </w:r>
+      <w:bookmarkEnd w:id="9"/>
+    </w:p>
+    <w:p>
+      <w:pPr>
+        <w:pStyle w:val="BlockText"/>
+      </w:pPr>
+      <w:r>
+        <w:rPr>
+          <w:b/>
+          <w:bCs/>
+        </w:rPr>
+        <w:t xml:space="preserve">This doc is HISTORICAL/REFERENCE.</w:t>
+      </w:r>
+      <w:r>
+        <w:t xml:space="preserve"> </w:t>
+      </w:r>
+      <w:r>
+        <w:t xml:space="preserve">Authoritative current state = the live site (www.setnayan.com) + shipped code +</w:t>
+      </w:r>
+      <w:r>
+        <w:t xml:space="preserve"> </w:t>
+      </w:r>
+      <w:r>
+        <w:rPr>
+          <w:rStyle w:val="VerbatimChar"/>
+        </w:rPr>
+        <w:t xml:space="preserve">AS_BUILT_GROUND_TRUTH_2026-06-07.md</w:t>
+      </w:r>
+      <w:r>
+        <w:t xml:space="preserve">. Deltas:</w:t>
+      </w:r>
+      <w:r>
+        <w:t xml:space="preserve"> </w:t>
+      </w:r>
+      <w:r>
+        <w:t xml:space="preserve">-</w:t>
+      </w:r>
+      <w:r>
+        <w:t xml:space="preserve"> </w:t>
+      </w:r>
+      <w:r>
+        <w:rPr>
+          <w:b/>
+          <w:bCs/>
+        </w:rPr>
+        <w:t xml:space="preserve">Largely still accurate as an SEO/GEO playbook</w:t>
+      </w:r>
+      <w:r>
+        <w:t xml:space="preserve"> </w:t>
+      </w:r>
+      <w:r>
+        <w:t xml:space="preserve">— the technical mechanics (GSC PH targeting, sitemap-index, JSON-LD schema, hreflang en/tl/ceb, CWV targets, hub-and-spoke linking, competitor/keyword landscape, AI-bot allow/disallow posture) are evergreen and unaffected by product/pricing drift. The §8 GEO product-description blurbs already correctly say</w:t>
+      </w:r>
+      <w:r>
+        <w:t xml:space="preserve"> </w:t>
+      </w:r>
+      <w:r>
+        <w:rPr>
+          <w:b/>
+          <w:bCs/>
+        </w:rPr>
+        <w:t xml:space="preserve">“apply-then-pay, no token wallet”</w:t>
+      </w:r>
+      <w:r>
+        <w:t xml:space="preserve"> </w:t>
+      </w:r>
+      <w:r>
+        <w:t xml:space="preserve">— that customer-side line still holds.</w:t>
+      </w:r>
+      <w:r>
+        <w:t xml:space="preserve"> </w:t>
+      </w:r>
+      <w:r>
+        <w:t xml:space="preserve">- Two business-model footnotes to keep in mind when writing public copy: commission is now</w:t>
+      </w:r>
+      <w:r>
+        <w:t xml:space="preserve"> </w:t>
+      </w:r>
+      <w:r>
+        <w:rPr>
+          <w:b/>
+          <w:bCs/>
+        </w:rPr>
+        <w:t xml:space="preserve">0% (</w:t>
+      </w:r>
+      <w:r>
+        <w:rPr>
+          <w:b/>
+          <w:bCs/>
+        </w:rPr>
+        <w:t xml:space="preserve">“0% commission, ever”</w:t>
+      </w:r>
+      <w:r>
+        <w:rPr>
+          <w:b/>
+          <w:bCs/>
+        </w:rPr>
+        <w:t xml:space="preserve">)</w:t>
+      </w:r>
+      <w:r>
+        <w:t xml:space="preserve"> </w:t>
+      </w:r>
+      <w:r>
+        <w:t xml:space="preserve">— never imply a Setnayan Pay 3/5% cut in any indexable marketing/blog page; and a</w:t>
+      </w:r>
+      <w:r>
+        <w:t xml:space="preserve"> </w:t>
+      </w:r>
+      <w:r>
+        <w:rPr>
+          <w:b/>
+          <w:bCs/>
+        </w:rPr>
+        <w:t xml:space="preserve">vendor-side token economy is now live</w:t>
+      </w:r>
+      <w:r>
+        <w:t xml:space="preserve"> </w:t>
+      </w:r>
+      <w:r>
+        <w:t xml:space="preserve">(the</w:t>
+      </w:r>
+      <w:r>
+        <w:t xml:space="preserve"> </w:t>
+      </w:r>
+      <w:r>
+        <w:t xml:space="preserve">“no token wallet”</w:t>
+      </w:r>
+      <w:r>
+        <w:t xml:space="preserve"> </w:t>
+      </w:r>
+      <w:r>
+        <w:t xml:space="preserve">line is couple-side only). BIR/receipts mentions (§0.12 GBP note, §8 disallow list) reference the</w:t>
+      </w:r>
+      <w:r>
+        <w:t xml:space="preserve"> </w:t>
+      </w:r>
+      <w:r>
+        <w:rPr>
+          <w:b/>
+          <w:bCs/>
+        </w:rPr>
+        <w:t xml:space="preserve">retiring</w:t>
+      </w:r>
+      <w:r>
+        <w:t xml:space="preserve"> </w:t>
+      </w:r>
+      <w:r>
+        <w:t xml:space="preserve">0026 surface — fine to keep behind</w:t>
+      </w:r>
+      <w:r>
+        <w:t xml:space="preserve"> </w:t>
+      </w:r>
+      <w:r>
+        <w:rPr>
+          <w:rStyle w:val="VerbatimChar"/>
+        </w:rPr>
+        <w:t xml:space="preserve">/admin/*</w:t>
+      </w:r>
+      <w:r>
+        <w:t xml:space="preserve"> </w:t>
+      </w:r>
+      <w:r>
+        <w:t xml:space="preserve">disallow, but don’t lead public SEO copy with</w:t>
+      </w:r>
+      <w:r>
+        <w:t xml:space="preserve"> </w:t>
+      </w:r>
+      <w:r>
+        <w:t xml:space="preserve">“BIR-compliant receipts”</w:t>
+      </w:r>
+      <w:r>
+        <w:t xml:space="preserve"> </w:t>
+      </w:r>
+      <w:r>
+        <w:t xml:space="preserve">as a headline differentiator.</w:t>
+      </w:r>
+      <w:r>
+        <w:t xml:space="preserve"> </w:t>
+      </w:r>
+      <w:r>
+        <w:t xml:space="preserve">- The two</w:t>
+      </w:r>
+      <w:r>
+        <w:t xml:space="preserve"> </w:t>
+      </w:r>
+      <w:r>
+        <w:rPr>
+          <w:rStyle w:val="VerbatimChar"/>
+        </w:rPr>
+        <w:t xml:space="preserve">[SPEC CHANGE]</w:t>
+      </w:r>
+      <w:r>
+        <w:t xml:space="preserve"> </w:t>
+      </w:r>
+      <w:r>
+        <w:t xml:space="preserve">flags (public</w:t>
+      </w:r>
+      <w:r>
+        <w:t xml:space="preserve"> </w:t>
+      </w:r>
+      <w:r>
+        <w:rPr>
+          <w:rStyle w:val="VerbatimChar"/>
+        </w:rPr>
+        <w:t xml:space="preserve">/supplies/*</w:t>
+      </w:r>
+      <w:r>
+        <w:t xml:space="preserve"> </w:t>
+      </w:r>
+      <w:r>
+        <w:t xml:space="preserve">browse + public</w:t>
+      </w:r>
+      <w:r>
+        <w:t xml:space="preserve"> </w:t>
+      </w:r>
+      <w:r>
+        <w:rPr>
+          <w:rStyle w:val="VerbatimChar"/>
+        </w:rPr>
+        <w:t xml:space="preserve">/v/[slug]</w:t>
+      </w:r>
+      <w:r>
+        <w:t xml:space="preserve"> </w:t>
+      </w:r>
+      <w:r>
+        <w:t xml:space="preserve">profiles) remain open/aspirational: the marketplace is founder-only today and supplies (0018) is a deferred mock, so the indexable-surface roadmap is still forward-looking, not as-built.</w:t>
+      </w:r>
+    </w:p>
+    <w:p>
+      <w:pPr>
+        <w:pStyle w:val="BlockText"/>
+      </w:pPr>
+      <w:r>
+        <w:t xml:space="preserve">When this body disagrees with the above,</w:t>
+      </w:r>
+      <w:r>
+        <w:t xml:space="preserve"> </w:t>
+      </w:r>
+      <w:r>
+        <w:rPr>
+          <w:b/>
+          <w:bCs/>
+        </w:rPr>
+        <w:t xml:space="preserve">the above wins.</w:t>
       </w:r>
     </w:p>
     <w:p>
@@ -371,8 +625,8 @@
         </w:pict>
       </w:r>
     </w:p>
-    <w:bookmarkEnd w:id="9"/>
-    <w:bookmarkStart w:id="112" w:name="Xf93a702fde288072fcdce28dae61a0535eb3790"/>
+    <w:bookmarkEnd w:id="10"/>
+    <w:bookmarkStart w:id="113" w:name="Xf93a702fde288072fcdce28dae61a0535eb3790"/>
     <w:p>
       <w:pPr>
         <w:pStyle w:val="Heading1"/>
@@ -635,7 +889,7 @@
         </w:pict>
       </w:r>
     </w:p>
-    <w:bookmarkStart w:id="10" w:name="tldr-15-highest-leverage-moves"/>
+    <w:bookmarkStart w:id="11" w:name="tldr-15-highest-leverage-moves"/>
     <w:p>
       <w:pPr>
         <w:pStyle w:val="Heading2"/>
@@ -1791,8 +2045,8 @@
         </w:pict>
       </w:r>
     </w:p>
-    <w:bookmarkEnd w:id="10"/>
-    <w:bookmarkStart w:id="11" w:name="Xc523e0f9a4ab4c3dd90abade2e340fde1a63bdc"/>
+    <w:bookmarkEnd w:id="11"/>
+    <w:bookmarkStart w:id="12" w:name="Xc523e0f9a4ab4c3dd90abade2e340fde1a63bdc"/>
     <w:p>
       <w:pPr>
         <w:pStyle w:val="Heading2"/>
@@ -3332,8 +3586,8 @@
         </w:pict>
       </w:r>
     </w:p>
-    <w:bookmarkEnd w:id="11"/>
-    <w:bookmarkStart w:id="17" w:name="X00205e54e84872055385a48b9f5a4f2b741d278"/>
+    <w:bookmarkEnd w:id="12"/>
+    <w:bookmarkStart w:id="18" w:name="X00205e54e84872055385a48b9f5a4f2b741d278"/>
     <w:p>
       <w:pPr>
         <w:pStyle w:val="Heading2"/>
@@ -3342,7 +3596,7 @@
         <w:t xml:space="preserve">2. Keyword landscape — what Filipinos actually search</w:t>
       </w:r>
     </w:p>
-    <w:bookmarkStart w:id="12" w:name="head-terms-transactional-commercial"/>
+    <w:bookmarkStart w:id="13" w:name="head-terms-transactional-commercial"/>
     <w:p>
       <w:pPr>
         <w:pStyle w:val="Heading3"/>
@@ -4171,8 +4425,8 @@
         </w:tc>
       </w:tr>
     </w:tbl>
-    <w:bookmarkEnd w:id="12"/>
-    <w:bookmarkStart w:id="13" w:name="X56782dd172728e4097da0ec04dd8b7e17412ff5"/>
+    <w:bookmarkEnd w:id="13"/>
+    <w:bookmarkStart w:id="14" w:name="X56782dd172728e4097da0ec04dd8b7e17412ff5"/>
     <w:p>
       <w:pPr>
         <w:pStyle w:val="Heading3"/>
@@ -4768,8 +5022,8 @@
         </w:tc>
       </w:tr>
     </w:tbl>
-    <w:bookmarkEnd w:id="13"/>
-    <w:bookmarkStart w:id="14" w:name="long-tail-informational-blog-gold"/>
+    <w:bookmarkEnd w:id="14"/>
+    <w:bookmarkStart w:id="15" w:name="long-tail-informational-blog-gold"/>
     <w:p>
       <w:pPr>
         <w:pStyle w:val="Heading3"/>
@@ -4898,8 +5152,8 @@
         <w:t xml:space="preserve">“destination wedding Philippines vendors”</w:t>
       </w:r>
     </w:p>
-    <w:bookmarkEnd w:id="14"/>
-    <w:bookmarkStart w:id="15" w:name="search-intent-clustering"/>
+    <w:bookmarkEnd w:id="15"/>
+    <w:bookmarkStart w:id="16" w:name="search-intent-clustering"/>
     <w:p>
       <w:pPr>
         <w:pStyle w:val="Heading3"/>
@@ -5238,8 +5492,8 @@
         </w:tc>
       </w:tr>
     </w:tbl>
-    <w:bookmarkEnd w:id="15"/>
-    <w:bookmarkStart w:id="16" w:name="ph-specific-seasonality"/>
+    <w:bookmarkEnd w:id="16"/>
+    <w:bookmarkStart w:id="17" w:name="ph-specific-seasonality"/>
     <w:p>
       <w:pPr>
         <w:pStyle w:val="Heading3"/>
@@ -5349,9 +5603,9 @@
         </w:pict>
       </w:r>
     </w:p>
-    <w:bookmarkEnd w:id="16"/>
     <w:bookmarkEnd w:id="17"/>
-    <w:bookmarkStart w:id="18" w:name="competitor-landscape-top-5-ph-players"/>
+    <w:bookmarkEnd w:id="18"/>
+    <w:bookmarkStart w:id="19" w:name="competitor-landscape-top-5-ph-players"/>
     <w:p>
       <w:pPr>
         <w:pStyle w:val="Heading2"/>
@@ -6328,8 +6582,8 @@
         </w:pict>
       </w:r>
     </w:p>
-    <w:bookmarkEnd w:id="18"/>
-    <w:bookmarkStart w:id="28" w:name="technical-seo-playbook-ph-specific"/>
+    <w:bookmarkEnd w:id="19"/>
+    <w:bookmarkStart w:id="29" w:name="technical-seo-playbook-ph-specific"/>
     <w:p>
       <w:pPr>
         <w:pStyle w:val="Heading2"/>
@@ -6338,7 +6592,7 @@
         <w:t xml:space="preserve">4. Technical SEO playbook (PH-specific)</w:t>
       </w:r>
     </w:p>
-    <w:bookmarkStart w:id="19" w:name="google-search-console-ph-geo-targeting"/>
+    <w:bookmarkStart w:id="20" w:name="google-search-console-ph-geo-targeting"/>
     <w:p>
       <w:pPr>
         <w:pStyle w:val="Heading3"/>
@@ -6507,8 +6761,8 @@
         <w:t xml:space="preserve">Repeat for Bing Webmaster Tools (a not-trivial slice of PH search).</w:t>
       </w:r>
     </w:p>
-    <w:bookmarkEnd w:id="19"/>
-    <w:bookmarkStart w:id="20" w:name="sitemap.xml-structure"/>
+    <w:bookmarkEnd w:id="20"/>
+    <w:bookmarkStart w:id="21" w:name="sitemap.xml-structure"/>
     <w:p>
       <w:pPr>
         <w:pStyle w:val="Heading3"/>
@@ -6662,8 +6916,8 @@
         <w:t xml:space="preserve">honestly.</w:t>
       </w:r>
     </w:p>
-    <w:bookmarkEnd w:id="20"/>
-    <w:bookmarkStart w:id="21" w:name="robots.txt-patterns"/>
+    <w:bookmarkEnd w:id="21"/>
+    <w:bookmarkStart w:id="22" w:name="robots.txt-patterns"/>
     <w:p>
       <w:pPr>
         <w:pStyle w:val="Heading3"/>
@@ -6942,8 +7196,8 @@
         <w:t xml:space="preserve">(deprecated for Google but still useful for Bing) and self-canonicals on each page. Pick one strategy per template and document it.</w:t>
       </w:r>
     </w:p>
-    <w:bookmarkEnd w:id="21"/>
-    <w:bookmarkStart w:id="22" w:name="schema-markup-what-to-ship-where"/>
+    <w:bookmarkEnd w:id="22"/>
+    <w:bookmarkStart w:id="23" w:name="schema-markup-what-to-ship-where"/>
     <w:p>
       <w:pPr>
         <w:pStyle w:val="Heading3"/>
@@ -7678,8 +7932,8 @@
         <w:t xml:space="preserve">listings.</w:t>
       </w:r>
     </w:p>
-    <w:bookmarkEnd w:id="22"/>
-    <w:bookmarkStart w:id="23" w:name="Xa469d570d3a8495b156b52de585dac0d2bbaa16"/>
+    <w:bookmarkEnd w:id="23"/>
+    <w:bookmarkStart w:id="24" w:name="Xa469d570d3a8495b156b52de585dac0d2bbaa16"/>
     <w:p>
       <w:pPr>
         <w:pStyle w:val="Heading3"/>
@@ -7970,8 +8224,8 @@
         <w:t xml:space="preserve">Run Lighthouse + PageSpeed Insights weekly; track Real User Metrics via GSC’s Page Experience report.</w:t>
       </w:r>
     </w:p>
-    <w:bookmarkEnd w:id="23"/>
-    <w:bookmarkStart w:id="24" w:name="hreflang-for-en-tl-ceb"/>
+    <w:bookmarkEnd w:id="24"/>
+    <w:bookmarkStart w:id="25" w:name="hreflang-for-en-tl-ceb"/>
     <w:p>
       <w:pPr>
         <w:pStyle w:val="Heading3"/>
@@ -8364,8 +8618,8 @@
         <w:t xml:space="preserve">as one of the locale-resolution mechanisms — make path-prefix the canonical form.)</w:t>
       </w:r>
     </w:p>
-    <w:bookmarkEnd w:id="24"/>
-    <w:bookmarkStart w:id="25" w:name="mobile-first"/>
+    <w:bookmarkEnd w:id="25"/>
+    <w:bookmarkStart w:id="26" w:name="mobile-first"/>
     <w:p>
       <w:pPr>
         <w:pStyle w:val="Heading3"/>
@@ -8450,8 +8704,8 @@
         <w:t xml:space="preserve">doesn’t ship the dashboard bottom-nav — that pollutes mobile UX expectations.</w:t>
       </w:r>
     </w:p>
-    <w:bookmarkEnd w:id="25"/>
-    <w:bookmarkStart w:id="26" w:name="internal-linking-strategy-hub-and-spoke"/>
+    <w:bookmarkEnd w:id="26"/>
+    <w:bookmarkStart w:id="27" w:name="internal-linking-strategy-hub-and-spoke"/>
     <w:p>
       <w:pPr>
         <w:pStyle w:val="Heading3"/>
@@ -8605,8 +8859,8 @@
         <w:t xml:space="preserve">Every page links up (to its parent hub) AND laterally (4–6 related siblings). No orphans. Footer should expose the top-level hubs. Header should expose primary nav (Supplies, Suppliers, Plan with Setnayan, Blog).</w:t>
       </w:r>
     </w:p>
-    <w:bookmarkEnd w:id="26"/>
-    <w:bookmarkStart w:id="27" w:name="url-structure-recommendations"/>
+    <w:bookmarkEnd w:id="27"/>
+    <w:bookmarkStart w:id="28" w:name="url-structure-recommendations"/>
     <w:p>
       <w:pPr>
         <w:pStyle w:val="Heading3"/>
@@ -9135,9 +9389,9 @@
         </w:pict>
       </w:r>
     </w:p>
-    <w:bookmarkEnd w:id="27"/>
     <w:bookmarkEnd w:id="28"/>
-    <w:bookmarkStart w:id="34" w:name="on-page-content-strategy"/>
+    <w:bookmarkEnd w:id="29"/>
+    <w:bookmarkStart w:id="35" w:name="on-page-content-strategy"/>
     <w:p>
       <w:pPr>
         <w:pStyle w:val="Heading2"/>
@@ -9146,7 +9400,7 @@
         <w:t xml:space="preserve">5. On-page + content strategy</w:t>
       </w:r>
     </w:p>
-    <w:bookmarkStart w:id="29" w:name="page-templates-needed-in-priority-order"/>
+    <w:bookmarkStart w:id="30" w:name="page-templates-needed-in-priority-order"/>
     <w:p>
       <w:pPr>
         <w:pStyle w:val="Heading3"/>
@@ -10025,8 +10279,8 @@
         </w:tc>
       </w:tr>
     </w:tbl>
-    <w:bookmarkEnd w:id="29"/>
-    <w:bookmarkStart w:id="30" w:name="title-meta-patterns-per-template"/>
+    <w:bookmarkEnd w:id="30"/>
+    <w:bookmarkStart w:id="31" w:name="title-meta-patterns-per-template"/>
     <w:p>
       <w:pPr>
         <w:pStyle w:val="Heading3"/>
@@ -10455,8 +10709,8 @@
         </w:tc>
       </w:tr>
     </w:tbl>
-    <w:bookmarkEnd w:id="30"/>
-    <w:bookmarkStart w:id="31" w:name="content-depth-minimums"/>
+    <w:bookmarkEnd w:id="31"/>
+    <w:bookmarkStart w:id="32" w:name="content-depth-minimums"/>
     <w:p>
       <w:pPr>
         <w:pStyle w:val="Heading3"/>
@@ -10603,8 +10857,8 @@
         <w:t xml:space="preserve">100–200 words per answer. Don’t pad.</w:t>
       </w:r>
     </w:p>
-    <w:bookmarkEnd w:id="31"/>
-    <w:bookmarkStart w:id="32" w:name="Xee0777ffdfec02713c63b97e7b7ffe6dcf6780e"/>
+    <w:bookmarkEnd w:id="32"/>
+    <w:bookmarkStart w:id="33" w:name="Xee0777ffdfec02713c63b97e7b7ffe6dcf6780e"/>
     <w:p>
       <w:pPr>
         <w:pStyle w:val="Heading3"/>
@@ -11009,8 +11263,8 @@
         <w:t xml:space="preserve">schema, (d) be cross-linked from at least 3 other pages.</w:t>
       </w:r>
     </w:p>
-    <w:bookmarkEnd w:id="32"/>
-    <w:bookmarkStart w:id="33" w:name="internal-linking-conventions"/>
+    <w:bookmarkEnd w:id="33"/>
+    <w:bookmarkStart w:id="34" w:name="internal-linking-conventions"/>
     <w:p>
       <w:pPr>
         <w:pStyle w:val="Heading3"/>
@@ -11225,9 +11479,9 @@
         </w:pict>
       </w:r>
     </w:p>
-    <w:bookmarkEnd w:id="33"/>
     <w:bookmarkEnd w:id="34"/>
-    <w:bookmarkStart w:id="39" w:name="local-off-page"/>
+    <w:bookmarkEnd w:id="35"/>
+    <w:bookmarkStart w:id="40" w:name="local-off-page"/>
     <w:p>
       <w:pPr>
         <w:pStyle w:val="Heading2"/>
@@ -11236,7 +11490,7 @@
         <w:t xml:space="preserve">6. Local + off-page</w:t>
       </w:r>
     </w:p>
-    <w:bookmarkStart w:id="35" w:name="google-business-profile"/>
+    <w:bookmarkStart w:id="36" w:name="google-business-profile"/>
     <w:p>
       <w:pPr>
         <w:pStyle w:val="Heading3"/>
@@ -11456,8 +11710,8 @@
         <w:t xml:space="preserve">Collect Google reviews from couples and vendors (one of the strongest local-pack signals).</w:t>
       </w:r>
     </w:p>
-    <w:bookmarkEnd w:id="35"/>
-    <w:bookmarkStart w:id="36" w:name="ph-directories-worth-listing-on"/>
+    <w:bookmarkEnd w:id="36"/>
+    <w:bookmarkStart w:id="37" w:name="ph-directories-worth-listing-on"/>
     <w:p>
       <w:pPr>
         <w:pStyle w:val="Heading3"/>
@@ -12018,8 +12272,8 @@
         <w:t xml:space="preserve">, not as a vendor — different intent, different category.</w:t>
       </w:r>
     </w:p>
-    <w:bookmarkEnd w:id="36"/>
-    <w:bookmarkStart w:id="37" w:name="backlink-targets-ph-press"/>
+    <w:bookmarkEnd w:id="37"/>
+    <w:bookmarkStart w:id="38" w:name="backlink-targets-ph-press"/>
     <w:p>
       <w:pPr>
         <w:pStyle w:val="Heading3"/>
@@ -12472,8 +12726,8 @@
         </w:tc>
       </w:tr>
     </w:tbl>
-    <w:bookmarkEnd w:id="37"/>
-    <w:bookmarkStart w:id="38" w:name="brand-signal-moves"/>
+    <w:bookmarkEnd w:id="38"/>
+    <w:bookmarkStart w:id="39" w:name="brand-signal-moves"/>
     <w:p>
       <w:pPr>
         <w:pStyle w:val="Heading3"/>
@@ -12650,9 +12904,9 @@
         </w:pict>
       </w:r>
     </w:p>
-    <w:bookmarkEnd w:id="38"/>
     <w:bookmarkEnd w:id="39"/>
-    <w:bookmarkStart w:id="44" w:name="prioritized-roadmap"/>
+    <w:bookmarkEnd w:id="40"/>
+    <w:bookmarkStart w:id="45" w:name="prioritized-roadmap"/>
     <w:p>
       <w:pPr>
         <w:pStyle w:val="Heading2"/>
@@ -12661,7 +12915,7 @@
         <w:t xml:space="preserve">7. Prioritized roadmap</w:t>
       </w:r>
     </w:p>
-    <w:bookmarkStart w:id="40" w:name="X5eda65ab851bb763c7880c7d797749472e24d72"/>
+    <w:bookmarkStart w:id="41" w:name="X5eda65ab851bb763c7880c7d797749472e24d72"/>
     <w:p>
       <w:pPr>
         <w:pStyle w:val="Heading3"/>
@@ -13471,8 +13725,8 @@
         </w:tc>
       </w:tr>
     </w:tbl>
-    <w:bookmarkEnd w:id="40"/>
-    <w:bookmarkStart w:id="41" w:name="X0af4a6c8419b1e044918fe580176dcf8c18a3bf"/>
+    <w:bookmarkEnd w:id="41"/>
+    <w:bookmarkStart w:id="42" w:name="X0af4a6c8419b1e044918fe580176dcf8c18a3bf"/>
     <w:p>
       <w:pPr>
         <w:pStyle w:val="Heading3"/>
@@ -14421,8 +14675,8 @@
         </w:tc>
       </w:tr>
     </w:tbl>
-    <w:bookmarkEnd w:id="41"/>
-    <w:bookmarkStart w:id="42" w:name="Xc129151f695d339b824231377348371a41b120d"/>
+    <w:bookmarkEnd w:id="42"/>
+    <w:bookmarkStart w:id="43" w:name="Xc129151f695d339b824231377348371a41b120d"/>
     <w:p>
       <w:pPr>
         <w:pStyle w:val="Heading3"/>
@@ -15436,8 +15690,8 @@
         </w:tc>
       </w:tr>
     </w:tbl>
-    <w:bookmarkEnd w:id="42"/>
-    <w:bookmarkStart w:id="43" w:name="Xd611f294b6c5e06271712bd7146d640cf54c2a8"/>
+    <w:bookmarkEnd w:id="43"/>
+    <w:bookmarkStart w:id="44" w:name="Xd611f294b6c5e06271712bd7146d640cf54c2a8"/>
     <w:p>
       <w:pPr>
         <w:pStyle w:val="Heading3"/>
@@ -16176,9 +16430,9 @@
         </w:pict>
       </w:r>
     </w:p>
-    <w:bookmarkEnd w:id="43"/>
     <w:bookmarkEnd w:id="44"/>
-    <w:bookmarkStart w:id="45" w:name="spec-conflict-flags"/>
+    <w:bookmarkEnd w:id="45"/>
+    <w:bookmarkStart w:id="46" w:name="spec-conflict-flags"/>
     <w:p>
       <w:pPr>
         <w:pStyle w:val="Heading2"/>
@@ -16631,8 +16885,8 @@
         </w:pict>
       </w:r>
     </w:p>
-    <w:bookmarkEnd w:id="45"/>
-    <w:bookmarkStart w:id="83" w:name="sources"/>
+    <w:bookmarkEnd w:id="46"/>
+    <w:bookmarkStart w:id="84" w:name="sources"/>
     <w:p>
       <w:pPr>
         <w:pStyle w:val="Heading2"/>
@@ -16661,7 +16915,7 @@
       <w:r>
         <w:t xml:space="preserve"> </w:t>
       </w:r>
-      <w:hyperlink r:id="rId46">
+      <w:hyperlink r:id="rId47">
         <w:r>
           <w:rPr>
             <w:rStyle w:val="Hyperlink"/>
@@ -16675,7 +16929,7 @@
       <w:r>
         <w:t xml:space="preserve"> </w:t>
       </w:r>
-      <w:hyperlink r:id="rId47">
+      <w:hyperlink r:id="rId48">
         <w:r>
           <w:rPr>
             <w:rStyle w:val="Hyperlink"/>
@@ -16689,7 +16943,7 @@
       <w:r>
         <w:t xml:space="preserve"> </w:t>
       </w:r>
-      <w:hyperlink r:id="rId48">
+      <w:hyperlink r:id="rId49">
         <w:r>
           <w:rPr>
             <w:rStyle w:val="Hyperlink"/>
@@ -16703,7 +16957,7 @@
       <w:r>
         <w:t xml:space="preserve"> </w:t>
       </w:r>
-      <w:hyperlink r:id="rId49">
+      <w:hyperlink r:id="rId50">
         <w:r>
           <w:rPr>
             <w:rStyle w:val="Hyperlink"/>
@@ -16738,7 +16992,7 @@
       <w:r>
         <w:t xml:space="preserve"> </w:t>
       </w:r>
-      <w:hyperlink r:id="rId50">
+      <w:hyperlink r:id="rId51">
         <w:r>
           <w:rPr>
             <w:rStyle w:val="Hyperlink"/>
@@ -16755,7 +17009,7 @@
       <w:r>
         <w:t xml:space="preserve"> </w:t>
       </w:r>
-      <w:hyperlink r:id="rId51">
+      <w:hyperlink r:id="rId52">
         <w:r>
           <w:rPr>
             <w:rStyle w:val="Hyperlink"/>
@@ -16772,7 +17026,7 @@
       <w:r>
         <w:t xml:space="preserve"> </w:t>
       </w:r>
-      <w:hyperlink r:id="rId52">
+      <w:hyperlink r:id="rId53">
         <w:r>
           <w:rPr>
             <w:rStyle w:val="Hyperlink"/>
@@ -16789,7 +17043,7 @@
       <w:r>
         <w:t xml:space="preserve"> </w:t>
       </w:r>
-      <w:hyperlink r:id="rId53">
+      <w:hyperlink r:id="rId54">
         <w:r>
           <w:rPr>
             <w:rStyle w:val="Hyperlink"/>
@@ -16806,7 +17060,7 @@
       <w:r>
         <w:t xml:space="preserve"> </w:t>
       </w:r>
-      <w:hyperlink r:id="rId54">
+      <w:hyperlink r:id="rId55">
         <w:r>
           <w:rPr>
             <w:rStyle w:val="Hyperlink"/>
@@ -16823,7 +17077,7 @@
       <w:r>
         <w:t xml:space="preserve"> </w:t>
       </w:r>
-      <w:hyperlink r:id="rId55">
+      <w:hyperlink r:id="rId56">
         <w:r>
           <w:rPr>
             <w:rStyle w:val="Hyperlink"/>
@@ -16840,7 +17094,7 @@
       <w:r>
         <w:t xml:space="preserve"> </w:t>
       </w:r>
-      <w:hyperlink r:id="rId56">
+      <w:hyperlink r:id="rId57">
         <w:r>
           <w:rPr>
             <w:rStyle w:val="Hyperlink"/>
@@ -16857,7 +17111,7 @@
       <w:r>
         <w:t xml:space="preserve"> </w:t>
       </w:r>
-      <w:hyperlink r:id="rId57">
+      <w:hyperlink r:id="rId58">
         <w:r>
           <w:rPr>
             <w:rStyle w:val="Hyperlink"/>
@@ -16874,7 +17128,7 @@
       <w:r>
         <w:t xml:space="preserve"> </w:t>
       </w:r>
-      <w:hyperlink r:id="rId58">
+      <w:hyperlink r:id="rId59">
         <w:r>
           <w:rPr>
             <w:rStyle w:val="Hyperlink"/>
@@ -16891,7 +17145,7 @@
       <w:r>
         <w:t xml:space="preserve"> </w:t>
       </w:r>
-      <w:hyperlink r:id="rId59">
+      <w:hyperlink r:id="rId60">
         <w:r>
           <w:rPr>
             <w:rStyle w:val="Hyperlink"/>
@@ -16908,7 +17162,7 @@
       <w:r>
         <w:t xml:space="preserve"> </w:t>
       </w:r>
-      <w:hyperlink r:id="rId60">
+      <w:hyperlink r:id="rId61">
         <w:r>
           <w:rPr>
             <w:rStyle w:val="Hyperlink"/>
@@ -16925,7 +17179,7 @@
       <w:r>
         <w:t xml:space="preserve"> </w:t>
       </w:r>
-      <w:hyperlink r:id="rId61">
+      <w:hyperlink r:id="rId62">
         <w:r>
           <w:rPr>
             <w:rStyle w:val="Hyperlink"/>
@@ -16954,7 +17208,7 @@
       <w:r>
         <w:t xml:space="preserve"> </w:t>
       </w:r>
-      <w:hyperlink r:id="rId62">
+      <w:hyperlink r:id="rId63">
         <w:r>
           <w:rPr>
             <w:rStyle w:val="Hyperlink"/>
@@ -16971,7 +17225,7 @@
       <w:r>
         <w:t xml:space="preserve"> </w:t>
       </w:r>
-      <w:hyperlink r:id="rId63">
+      <w:hyperlink r:id="rId64">
         <w:r>
           <w:rPr>
             <w:rStyle w:val="Hyperlink"/>
@@ -16988,7 +17242,7 @@
       <w:r>
         <w:t xml:space="preserve"> </w:t>
       </w:r>
-      <w:hyperlink r:id="rId64">
+      <w:hyperlink r:id="rId65">
         <w:r>
           <w:rPr>
             <w:rStyle w:val="Hyperlink"/>
@@ -17005,7 +17259,7 @@
       <w:r>
         <w:t xml:space="preserve"> </w:t>
       </w:r>
-      <w:hyperlink r:id="rId65">
+      <w:hyperlink r:id="rId66">
         <w:r>
           <w:rPr>
             <w:rStyle w:val="Hyperlink"/>
@@ -17022,7 +17276,7 @@
       <w:r>
         <w:t xml:space="preserve"> </w:t>
       </w:r>
-      <w:hyperlink r:id="rId66">
+      <w:hyperlink r:id="rId67">
         <w:r>
           <w:rPr>
             <w:rStyle w:val="Hyperlink"/>
@@ -17051,7 +17305,7 @@
       <w:r>
         <w:t xml:space="preserve"> </w:t>
       </w:r>
-      <w:hyperlink r:id="rId67">
+      <w:hyperlink r:id="rId68">
         <w:r>
           <w:rPr>
             <w:rStyle w:val="Hyperlink"/>
@@ -17068,7 +17322,7 @@
       <w:r>
         <w:t xml:space="preserve"> </w:t>
       </w:r>
-      <w:hyperlink r:id="rId68">
+      <w:hyperlink r:id="rId69">
         <w:r>
           <w:rPr>
             <w:rStyle w:val="Hyperlink"/>
@@ -17085,7 +17339,7 @@
       <w:r>
         <w:t xml:space="preserve"> </w:t>
       </w:r>
-      <w:hyperlink r:id="rId69">
+      <w:hyperlink r:id="rId70">
         <w:r>
           <w:rPr>
             <w:rStyle w:val="Hyperlink"/>
@@ -17102,7 +17356,7 @@
       <w:r>
         <w:t xml:space="preserve"> </w:t>
       </w:r>
-      <w:hyperlink r:id="rId70">
+      <w:hyperlink r:id="rId71">
         <w:r>
           <w:rPr>
             <w:rStyle w:val="Hyperlink"/>
@@ -17131,7 +17385,7 @@
       <w:r>
         <w:t xml:space="preserve"> </w:t>
       </w:r>
-      <w:hyperlink r:id="rId71">
+      <w:hyperlink r:id="rId72">
         <w:r>
           <w:rPr>
             <w:rStyle w:val="Hyperlink"/>
@@ -17148,7 +17402,7 @@
       <w:r>
         <w:t xml:space="preserve"> </w:t>
       </w:r>
-      <w:hyperlink r:id="rId72">
+      <w:hyperlink r:id="rId73">
         <w:r>
           <w:rPr>
             <w:rStyle w:val="Hyperlink"/>
@@ -17165,7 +17419,7 @@
       <w:r>
         <w:t xml:space="preserve"> </w:t>
       </w:r>
-      <w:hyperlink r:id="rId73">
+      <w:hyperlink r:id="rId74">
         <w:r>
           <w:rPr>
             <w:rStyle w:val="Hyperlink"/>
@@ -17194,7 +17448,7 @@
       <w:r>
         <w:t xml:space="preserve"> </w:t>
       </w:r>
-      <w:hyperlink r:id="rId74">
+      <w:hyperlink r:id="rId75">
         <w:r>
           <w:rPr>
             <w:rStyle w:val="Hyperlink"/>
@@ -17211,7 +17465,7 @@
       <w:r>
         <w:t xml:space="preserve"> </w:t>
       </w:r>
-      <w:hyperlink r:id="rId75">
+      <w:hyperlink r:id="rId76">
         <w:r>
           <w:rPr>
             <w:rStyle w:val="Hyperlink"/>
@@ -17228,7 +17482,7 @@
       <w:r>
         <w:t xml:space="preserve"> </w:t>
       </w:r>
-      <w:hyperlink r:id="rId76">
+      <w:hyperlink r:id="rId77">
         <w:r>
           <w:rPr>
             <w:rStyle w:val="Hyperlink"/>
@@ -17257,7 +17511,7 @@
       <w:r>
         <w:t xml:space="preserve"> </w:t>
       </w:r>
-      <w:hyperlink r:id="rId77">
+      <w:hyperlink r:id="rId78">
         <w:r>
           <w:rPr>
             <w:rStyle w:val="Hyperlink"/>
@@ -17274,7 +17528,7 @@
       <w:r>
         <w:t xml:space="preserve"> </w:t>
       </w:r>
-      <w:hyperlink r:id="rId78">
+      <w:hyperlink r:id="rId79">
         <w:r>
           <w:rPr>
             <w:rStyle w:val="Hyperlink"/>
@@ -17303,7 +17557,7 @@
       <w:r>
         <w:t xml:space="preserve"> </w:t>
       </w:r>
-      <w:hyperlink r:id="rId79">
+      <w:hyperlink r:id="rId80">
         <w:r>
           <w:rPr>
             <w:rStyle w:val="Hyperlink"/>
@@ -17320,7 +17574,7 @@
       <w:r>
         <w:t xml:space="preserve"> </w:t>
       </w:r>
-      <w:hyperlink r:id="rId80">
+      <w:hyperlink r:id="rId81">
         <w:r>
           <w:rPr>
             <w:rStyle w:val="Hyperlink"/>
@@ -17337,7 +17591,7 @@
       <w:r>
         <w:t xml:space="preserve"> </w:t>
       </w:r>
-      <w:hyperlink r:id="rId81">
+      <w:hyperlink r:id="rId82">
         <w:r>
           <w:rPr>
             <w:rStyle w:val="Hyperlink"/>
@@ -17354,7 +17608,7 @@
       <w:r>
         <w:t xml:space="preserve"> </w:t>
       </w:r>
-      <w:hyperlink r:id="rId82">
+      <w:hyperlink r:id="rId83">
         <w:r>
           <w:rPr>
             <w:rStyle w:val="Hyperlink"/>
@@ -17427,8 +17681,8 @@
         </w:pict>
       </w:r>
     </w:p>
-    <w:bookmarkEnd w:id="83"/>
-    <w:bookmarkStart w:id="90" w:name="X7d15544eacf724a1d097468b12f3f59651bc1b6"/>
+    <w:bookmarkEnd w:id="84"/>
+    <w:bookmarkStart w:id="91" w:name="X7d15544eacf724a1d097468b12f3f59651bc1b6"/>
     <w:p>
       <w:pPr>
         <w:pStyle w:val="Heading2"/>
@@ -17461,7 +17715,7 @@
         <w:t xml:space="preserve">Goal: appear in answers from ChatGPT / Claude / Perplexity / Gemini / SearchGPT when Filipinos ask AI assistants for wedding supplier or supplies recommendations — without exposing the dashboard, API, or application logic.</w:t>
       </w:r>
     </w:p>
-    <w:bookmarkStart w:id="84" w:name="posture-recommend-us-dont-train-on-us"/>
+    <w:bookmarkStart w:id="85" w:name="posture-recommend-us-dont-train-on-us"/>
     <w:p>
       <w:pPr>
         <w:pStyle w:val="Heading3"/>
@@ -18435,8 +18689,8 @@
         </w:tc>
       </w:tr>
     </w:tbl>
-    <w:bookmarkEnd w:id="84"/>
-    <w:bookmarkStart w:id="85" w:name="robots.txt-the-concrete-bot-policy"/>
+    <w:bookmarkEnd w:id="85"/>
+    <w:bookmarkStart w:id="86" w:name="robots.txt-the-concrete-bot-policy"/>
     <w:p>
       <w:pPr>
         <w:pStyle w:val="Heading3"/>
@@ -19320,8 +19574,8 @@
         <w:t xml:space="preserve">Sitemap: https://www.setnayan.com/sitemap.xml</w:t>
       </w:r>
     </w:p>
-    <w:bookmarkEnd w:id="85"/>
-    <w:bookmarkStart w:id="86" w:name="llms.txt-markdown-site-map-for-llms"/>
+    <w:bookmarkEnd w:id="86"/>
+    <w:bookmarkStart w:id="87" w:name="llms.txt-markdown-site-map-for-llms"/>
     <w:p>
       <w:pPr>
         <w:pStyle w:val="Heading3"/>
@@ -19889,8 +20143,8 @@
         <w:t xml:space="preserve">](https://www.setnayan.com/coverage)</w:t>
       </w:r>
     </w:p>
-    <w:bookmarkEnd w:id="86"/>
-    <w:bookmarkStart w:id="87" w:name="layer-2-make-ai-want-to-recommend"/>
+    <w:bookmarkEnd w:id="87"/>
+    <w:bookmarkStart w:id="88" w:name="layer-2-make-ai-want-to-recommend"/>
     <w:p>
       <w:pPr>
         <w:pStyle w:val="Heading3"/>
@@ -20392,8 +20646,8 @@
         </w:tc>
       </w:tr>
     </w:tbl>
-    <w:bookmarkEnd w:id="87"/>
-    <w:bookmarkStart w:id="88" w:name="X5767d64882a63d935a3aeb8ad5e8de7fd34c2c7"/>
+    <w:bookmarkEnd w:id="88"/>
+    <w:bookmarkStart w:id="89" w:name="X5767d64882a63d935a3aeb8ad5e8de7fd34c2c7"/>
     <w:p>
       <w:pPr>
         <w:pStyle w:val="Heading3"/>
@@ -20713,8 +20967,8 @@
         <w:t xml:space="preserve">measures needed beyond what’s already in the path-based disallow rules.</w:t>
       </w:r>
     </w:p>
-    <w:bookmarkEnd w:id="88"/>
-    <w:bookmarkStart w:id="89" w:name="overlap-with-classic-seo"/>
+    <w:bookmarkEnd w:id="89"/>
+    <w:bookmarkStart w:id="90" w:name="overlap-with-classic-seo"/>
     <w:p>
       <w:pPr>
         <w:pStyle w:val="Heading3"/>
@@ -20810,9 +21064,9 @@
         </w:pict>
       </w:r>
     </w:p>
-    <w:bookmarkEnd w:id="89"/>
     <w:bookmarkEnd w:id="90"/>
-    <w:bookmarkStart w:id="94" w:name="X9b30efd661cbf14bf7c944bf888996969358955"/>
+    <w:bookmarkEnd w:id="91"/>
+    <w:bookmarkStart w:id="95" w:name="X9b30efd661cbf14bf7c944bf888996969358955"/>
     <w:p>
       <w:pPr>
         <w:pStyle w:val="Heading2"/>
@@ -21016,7 +21270,7 @@
         <w:t xml:space="preserve">Schema, hreflang, sitemap auto-gen, internal linking — far cheaper to design into templates as they ship than to retrofit afterward.</w:t>
       </w:r>
     </w:p>
-    <w:bookmarkStart w:id="91" w:name="phase-table"/>
+    <w:bookmarkStart w:id="92" w:name="phase-table"/>
     <w:p>
       <w:pPr>
         <w:pStyle w:val="Heading3"/>
@@ -21304,8 +21558,8 @@
         </w:tc>
       </w:tr>
     </w:tbl>
-    <w:bookmarkEnd w:id="91"/>
-    <w:bookmarkStart w:id="92" w:name="whats-worth-deferring"/>
+    <w:bookmarkEnd w:id="92"/>
+    <w:bookmarkStart w:id="93" w:name="whats-worth-deferring"/>
     <w:p>
       <w:pPr>
         <w:pStyle w:val="Heading3"/>
@@ -21377,8 +21631,8 @@
         <w:t xml:space="preserve">(§6.4): pure marketing-spend; defer until launch so you have working surfaces to demo.</w:t>
       </w:r>
     </w:p>
-    <w:bookmarkEnd w:id="92"/>
-    <w:bookmarkStart w:id="93" w:name="the-two-spec-change-blockers-still-open"/>
+    <w:bookmarkEnd w:id="93"/>
+    <w:bookmarkStart w:id="94" w:name="the-two-spec-change-blockers-still-open"/>
     <w:p>
       <w:pPr>
         <w:pStyle w:val="Heading3"/>
@@ -21523,9 +21777,9 @@
         </w:pict>
       </w:r>
     </w:p>
-    <w:bookmarkEnd w:id="93"/>
     <w:bookmarkEnd w:id="94"/>
-    <w:bookmarkStart w:id="95" w:name="where-to-find-related-decisions"/>
+    <w:bookmarkEnd w:id="95"/>
+    <w:bookmarkStart w:id="96" w:name="where-to-find-related-decisions"/>
     <w:p>
       <w:pPr>
         <w:pStyle w:val="Heading2"/>
@@ -21598,8 +21852,8 @@
         </w:pict>
       </w:r>
     </w:p>
-    <w:bookmarkEnd w:id="95"/>
-    <w:bookmarkStart w:id="111" w:name="X85996eddcb9e3f459695fd1f4f5b226aaad143e"/>
+    <w:bookmarkEnd w:id="96"/>
+    <w:bookmarkStart w:id="112" w:name="X85996eddcb9e3f459695fd1f4f5b226aaad143e"/>
     <w:p>
       <w:pPr>
         <w:pStyle w:val="Heading2"/>
@@ -21901,7 +22155,7 @@
         <w:t xml:space="preserve">memory (Customers, Vendors, Admins) still hold.</w:t>
       </w:r>
     </w:p>
-    <w:bookmarkStart w:id="96" w:name="vendor-acquisition-seo"/>
+    <w:bookmarkStart w:id="97" w:name="vendor-acquisition-seo"/>
     <w:p>
       <w:pPr>
         <w:pStyle w:val="Heading3"/>
@@ -22767,8 +23021,8 @@
         <w:t xml:space="preserve">(publish as vendors hit milestones; recurring format)</w:t>
       </w:r>
     </w:p>
-    <w:bookmarkEnd w:id="96"/>
-    <w:bookmarkStart w:id="97" w:name="Xf5df4130bbaea35f13de89d778320fc3cc182e1"/>
+    <w:bookmarkEnd w:id="97"/>
+    <w:bookmarkStart w:id="98" w:name="Xf5df4130bbaea35f13de89d778320fc3cc182e1"/>
     <w:p>
       <w:pPr>
         <w:pStyle w:val="Heading3"/>
@@ -23590,8 +23844,8 @@
         <w:t xml:space="preserve">type queries.</w:t>
       </w:r>
     </w:p>
-    <w:bookmarkEnd w:id="97"/>
-    <w:bookmarkStart w:id="98" w:name="homepage-featured-fairs-section"/>
+    <w:bookmarkEnd w:id="98"/>
+    <w:bookmarkStart w:id="99" w:name="homepage-featured-fairs-section"/>
     <w:p>
       <w:pPr>
         <w:pStyle w:val="Heading3"/>
@@ -23930,8 +24184,8 @@
         <w:t xml:space="preserve">         28 vendors · Free for couples · [Register or book a booth →]</w:t>
       </w:r>
     </w:p>
-    <w:bookmarkEnd w:id="98"/>
-    <w:bookmarkStart w:id="99" w:name="X4d0ec98fa45cb7dffa7c44d8f974457bd7b9ce9"/>
+    <w:bookmarkEnd w:id="99"/>
+    <w:bookmarkStart w:id="100" w:name="X4d0ec98fa45cb7dffa7c44d8f974457bd7b9ce9"/>
     <w:p>
       <w:pPr>
         <w:pStyle w:val="Heading3"/>
@@ -24413,8 +24667,8 @@
         <w:t xml:space="preserve">Email automations triggered at: deal signed (welcome), T-60 (page-live notice), T-30 (initial blast), T-7 (final reminder), T+1 (thank-you + post-event survey)</w:t>
       </w:r>
     </w:p>
-    <w:bookmarkEnd w:id="99"/>
-    <w:bookmarkStart w:id="100" w:name="free-during-launch-positioning-amplified"/>
+    <w:bookmarkEnd w:id="100"/>
+    <w:bookmarkStart w:id="101" w:name="free-during-launch-positioning-amplified"/>
     <w:p>
       <w:pPr>
         <w:pStyle w:val="Heading3"/>
@@ -24557,8 +24811,8 @@
         <w:t xml:space="preserve">— implies will eventually be paid; creates urgency)</w:t>
       </w:r>
     </w:p>
-    <w:bookmarkEnd w:id="100"/>
-    <w:bookmarkStart w:id="101" w:name="Xdf182ae787075d5e826c33ac6d0fc95df1943d1"/>
+    <w:bookmarkEnd w:id="101"/>
+    <w:bookmarkStart w:id="102" w:name="Xdf182ae787075d5e826c33ac6d0fc95df1943d1"/>
     <w:p>
       <w:pPr>
         <w:pStyle w:val="Heading3"/>
@@ -24693,8 +24947,8 @@
         <w:t xml:space="preserve">For smaller regional fair operators (Cebu, Davao, Iloilo, Baguio bridal-fair organizers): boost-service onboarding is the primary play. They get a free landing page on Setnayan, vendors and couples on Setnayan are exposed to their fair, Setnayan gets the indexable surface + multi-sided liquidity.</w:t>
       </w:r>
     </w:p>
-    <w:bookmarkEnd w:id="101"/>
-    <w:bookmarkStart w:id="102" w:name="spec-change-flags-from-section-11"/>
+    <w:bookmarkEnd w:id="102"/>
+    <w:bookmarkStart w:id="103" w:name="spec-change-flags-from-section-11"/>
     <w:p>
       <w:pPr>
         <w:pStyle w:val="Heading3"/>
@@ -25103,8 +25357,8 @@
         <w:t xml:space="preserve">are gated on spec — don’t ship until iteration spec exists.</w:t>
       </w:r>
     </w:p>
-    <w:bookmarkEnd w:id="102"/>
-    <w:bookmarkStart w:id="110" w:name="X1ba0b25003dc0794a18399b6dbc71bb13985655"/>
+    <w:bookmarkEnd w:id="103"/>
+    <w:bookmarkStart w:id="111" w:name="X1ba0b25003dc0794a18399b6dbc71bb13985655"/>
     <w:p>
       <w:pPr>
         <w:pStyle w:val="Heading3"/>
@@ -25301,7 +25555,7 @@
         <w:t xml:space="preserve">until Setnayan has audience leverage (~10K active couple users + ~500 verified vendors), Model B pricing realistically lands at the low end of the cash ranges below — fair organizers picking Model B in the pre-launch / early-launch window are paying for early-mover access to a growing surface, not for proven audience reach. Setnayan should be transparent about this in the signup flow so deal regret doesn’t sour the partnership.</w:t>
       </w:r>
     </w:p>
-    <w:bookmarkStart w:id="103" w:name="X1003ed72ca347e6aa5ccc23d2adb44c4895f5cd"/>
+    <w:bookmarkStart w:id="104" w:name="X1003ed72ca347e6aa5ccc23d2adb44c4895f5cd"/>
     <w:p>
       <w:pPr>
         <w:pStyle w:val="Heading4"/>
@@ -26296,8 +26550,8 @@
         <w:t xml:space="preserve">, not an SEO acquisition page; post-gate it transitions to an active-signup surface.</w:t>
       </w:r>
     </w:p>
-    <w:bookmarkEnd w:id="103"/>
-    <w:bookmarkStart w:id="104" w:name="model-a-free-barter-no-cash-exchanged"/>
+    <w:bookmarkEnd w:id="104"/>
+    <w:bookmarkStart w:id="105" w:name="model-a-free-barter-no-cash-exchanged"/>
     <w:p>
       <w:pPr>
         <w:pStyle w:val="Heading4"/>
@@ -26673,8 +26927,8 @@
         <w:t xml:space="preserve">(owner-locked 2026-06-04) — Setnayan negotiates for it as part of the Model A in-kind exchange where the fair extends one, but a fair that offers no discount still qualifies; the couple perk + free booth + sponsor billing + stage time carry the value-exchange.</w:t>
       </w:r>
     </w:p>
-    <w:bookmarkEnd w:id="104"/>
-    <w:bookmarkStart w:id="105" w:name="model-b-cash-tiers-paid-sponsorship"/>
+    <w:bookmarkEnd w:id="105"/>
+    <w:bookmarkStart w:id="106" w:name="model-b-cash-tiers-paid-sponsorship"/>
     <w:p>
       <w:pPr>
         <w:pStyle w:val="Heading4"/>
@@ -27084,8 +27338,8 @@
         <w:t xml:space="preserve">ranges are anchored to PH directory featured-listing comparables (Kasal.com, Bridestory PH). They are the most uncertain numbers in this section and need market validation.</w:t>
       </w:r>
     </w:p>
-    <w:bookmarkEnd w:id="105"/>
-    <w:bookmarkStart w:id="106" w:name="pricing-ladder-discipline"/>
+    <w:bookmarkEnd w:id="106"/>
+    <w:bookmarkStart w:id="107" w:name="pricing-ladder-discipline"/>
     <w:p>
       <w:pPr>
         <w:pStyle w:val="Heading4"/>
@@ -27186,8 +27440,8 @@
         <w:t xml:space="preserve">(owner-locked 2026-06-03 · priced up from the earlier ₱4,999 starting suggestion for the 3-slot scarcity + qualified audience — see DECISION_LOG + 0042 § 6.5). Don’t quote round numbers (₱3,000, ₱5,000, etc.) — they violate the brand-consistency rule.</w:t>
       </w:r>
     </w:p>
-    <w:bookmarkEnd w:id="106"/>
-    <w:bookmarkStart w:id="107" w:name="where-the-boost-service-spec-lands"/>
+    <w:bookmarkEnd w:id="107"/>
+    <w:bookmarkStart w:id="108" w:name="where-the-boost-service-spec-lands"/>
     <w:p>
       <w:pPr>
         <w:pStyle w:val="Heading4"/>
@@ -27433,8 +27687,8 @@
         <w:t xml:space="preserve">— append the Model B SKUs once owner-validated prices are locked.</w:t>
       </w:r>
     </w:p>
-    <w:bookmarkEnd w:id="107"/>
-    <w:bookmarkStart w:id="108" w:name="X5b2f52cd882bace0a54da2a898d25ac50c73911"/>
+    <w:bookmarkEnd w:id="108"/>
+    <w:bookmarkStart w:id="109" w:name="X5b2f52cd882bace0a54da2a898d25ac50c73911"/>
     <w:p>
       <w:pPr>
         <w:pStyle w:val="Heading4"/>
@@ -27615,8 +27869,8 @@
         <w:t xml:space="preserve">The discount is the fair’s customer-acquisition expense; Setnayan is paid in funnel attribution + brand exposure + free booth + sponsor billing.</w:t>
       </w:r>
     </w:p>
-    <w:bookmarkEnd w:id="108"/>
-    <w:bookmarkStart w:id="109" w:name="X55bd010d6b2346833efd4dc604ae607e96434db"/>
+    <w:bookmarkEnd w:id="109"/>
+    <w:bookmarkStart w:id="110" w:name="X55bd010d6b2346833efd4dc604ae607e96434db"/>
     <w:p>
       <w:pPr>
         <w:pStyle w:val="Heading4"/>
@@ -27765,10 +28019,10 @@
         <w:t xml:space="preserve">— Setnayan’s on-site staffing has a real cost; should there be a limit before Model B kicks in even if Setnayan technically lacks audience leverage?</w:t>
       </w:r>
     </w:p>
-    <w:bookmarkEnd w:id="109"/>
     <w:bookmarkEnd w:id="110"/>
     <w:bookmarkEnd w:id="111"/>
     <w:bookmarkEnd w:id="112"/>
+    <w:bookmarkEnd w:id="113"/>
     <w:sectPr>
       <w:footnotePr>
         <w:numRestart w:val="eachSect"/>

</xml_diff>